<commit_message>
docs: add comprehensive documentation for data field definitions in Danh_Sach_Truong_Tong_Hop.md
</commit_message>
<xml_diff>
--- a/backend-app/samples/biểu mẫu tiệc/BIEN BAN LUU MAU THUC AN KH.docx
+++ b/backend-app/samples/biểu mẫu tiệc/BIEN BAN LUU MAU THUC AN KH.docx
@@ -12,8 +12,6 @@
           <w:sz w:val="36"/>
         </w:rPr>
       </w:pPr>
-      <w:bookmarkStart w:id="0" w:name="_GoBack"/>
-      <w:bookmarkEnd w:id="0"/>
       <w:r>
         <w:rPr>
           <w:sz w:val="36"/>
@@ -114,11 +112,12 @@
       </w:r>
       <w:r>
         <w:rPr>
+          <w:rFonts w:hint="default"/>
           <w:b w:val="0"/>
           <w:bCs w:val="0"/>
           <w:sz w:val="24"/>
         </w:rPr>
-        <w:t>Ngày ………………… Giờ: …….</w:t>
+        <w:t>Ngày: {NgayToChuc} Giờ: {TiecGioBatDau}</w:t>
       </w:r>
     </w:p>
     <w:p>
@@ -182,7 +181,6 @@
         </w:tblPrEx>
         <w:trPr>
           <w:gridAfter w:val="1"/>
-          <w:wBefore w:w="0" w:type="dxa"/>
           <w:wAfter w:w="14" w:type="dxa"/>
           <w:cantSplit/>
           <w:trHeight w:val="928" w:hRule="atLeast"/>
@@ -211,14 +209,45 @@
                 <w:b w:val="0"/>
                 <w:sz w:val="24"/>
               </w:rPr>
-              <w:t xml:space="preserve">Tiệc: ……………………………………………Số bàn/khách:………..…     Sảnh tiệc: </w:t>
-            </w:r>
-            <w:r>
-              <w:rPr>
-                <w:i/>
-                <w:sz w:val="24"/>
-              </w:rPr>
-              <w:t>……………….</w:t>
+              <w:t xml:space="preserve">Tiệc: </w:t>
+            </w:r>
+            <w:r>
+              <w:rPr>
+                <w:rFonts w:hint="default"/>
+                <w:b w:val="0"/>
+                <w:sz w:val="24"/>
+              </w:rPr>
+              <w:t xml:space="preserve">{LoaiHinhSuKien} </w:t>
+            </w:r>
+            <w:r>
+              <w:rPr>
+                <w:b w:val="0"/>
+                <w:sz w:val="24"/>
+              </w:rPr>
+              <w:t>Số bàn/khách:</w:t>
+            </w:r>
+            <w:r>
+              <w:rPr>
+                <w:rFonts w:hint="default"/>
+                <w:b w:val="0"/>
+                <w:sz w:val="24"/>
+              </w:rPr>
+              <w:t>{TongSoBan}</w:t>
+            </w:r>
+            <w:r>
+              <w:rPr>
+                <w:b w:val="0"/>
+                <w:sz w:val="24"/>
+              </w:rPr>
+              <w:t xml:space="preserve">     Sảnh tiệc: </w:t>
+            </w:r>
+            <w:r>
+              <w:rPr>
+                <w:rFonts w:hint="default"/>
+                <w:b w:val="0"/>
+                <w:sz w:val="24"/>
+              </w:rPr>
+              <w:t>{TiecSanhTiec}</w:t>
             </w:r>
           </w:p>
           <w:p>
@@ -241,7 +270,40 @@
                 <w:bCs/>
                 <w:sz w:val="24"/>
               </w:rPr>
-              <w:t>Tên khách hàng: ………………………………………….…Số ĐT:………………………………………</w:t>
+              <w:t xml:space="preserve">Tên khách hàng: </w:t>
+            </w:r>
+            <w:r>
+              <w:rPr>
+                <w:rFonts w:hint="default" w:ascii="Arial" w:hAnsi="Arial" w:cs="Arial"/>
+                <w:bCs/>
+                <w:sz w:val="24"/>
+              </w:rPr>
+              <w:t xml:space="preserve">{BenBTenChuTiec} </w:t>
+            </w:r>
+            <w:r>
+              <w:rPr>
+                <w:rFonts w:hint="default" w:ascii="Arial" w:hAnsi="Arial" w:cs="Arial"/>
+                <w:bCs/>
+                <w:sz w:val="24"/>
+                <w:lang w:val="en-US"/>
+              </w:rPr>
+              <w:t xml:space="preserve"> </w:t>
+            </w:r>
+            <w:r>
+              <w:rPr>
+                <w:rFonts w:ascii="Arial" w:hAnsi="Arial" w:cs="Arial"/>
+                <w:bCs/>
+                <w:sz w:val="24"/>
+              </w:rPr>
+              <w:t>Số ĐT:</w:t>
+            </w:r>
+            <w:r>
+              <w:rPr>
+                <w:rFonts w:hint="default" w:ascii="Arial" w:hAnsi="Arial" w:cs="Arial"/>
+                <w:bCs/>
+                <w:sz w:val="24"/>
+              </w:rPr>
+              <w:t>{BenBDienThoai}</w:t>
             </w:r>
           </w:p>
           <w:p>
@@ -264,7 +326,24 @@
                 <w:bCs/>
                 <w:sz w:val="24"/>
               </w:rPr>
-              <w:t>Địa chỉ:……………………..……………………………………………………………………………….</w:t>
+              <w:t>Địa chỉ:</w:t>
+            </w:r>
+            <w:r>
+              <w:rPr>
+                <w:rFonts w:hint="default" w:ascii="Arial" w:hAnsi="Arial" w:cs="Arial"/>
+                <w:bCs/>
+                <w:sz w:val="24"/>
+                <w:lang w:val="en-US"/>
+              </w:rPr>
+              <w:t xml:space="preserve"> </w:t>
+            </w:r>
+            <w:r>
+              <w:rPr>
+                <w:rFonts w:hint="default" w:ascii="Arial" w:hAnsi="Arial" w:cs="Arial"/>
+                <w:bCs/>
+                <w:sz w:val="24"/>
+              </w:rPr>
+              <w:t>{BenBDiaChi}</w:t>
             </w:r>
           </w:p>
         </w:tc>
@@ -288,7 +367,6 @@
         </w:tblPrEx>
         <w:trPr>
           <w:gridAfter w:val="1"/>
-          <w:wBefore w:w="0" w:type="dxa"/>
           <w:wAfter w:w="14" w:type="dxa"/>
           <w:cantSplit/>
           <w:trHeight w:val="301" w:hRule="atLeast"/>
@@ -336,7 +414,6 @@
         </w:tblPrEx>
         <w:trPr>
           <w:gridAfter w:val="1"/>
-          <w:wBefore w:w="0" w:type="dxa"/>
           <w:wAfter w:w="14" w:type="dxa"/>
           <w:cantSplit/>
           <w:trHeight w:val="575" w:hRule="atLeast"/>
@@ -379,8 +456,7 @@
           <w:p>
             <w:pPr>
               <w:numPr>
-                <w:ilvl w:val="0"/>
-                <w:numId w:val="1"/>
+                <w:numId w:val="0"/>
               </w:numPr>
               <w:rPr>
                 <w:b w:val="0"/>
@@ -390,228 +466,12 @@
             </w:pPr>
             <w:r>
               <w:rPr>
-                <w:b w:val="0"/>
-                <w:bCs w:val="0"/>
-                <w:sz w:val="22"/>
-              </w:rPr>
-              <w:t>……………………………………………………</w:t>
-            </w:r>
-          </w:p>
-          <w:p>
-            <w:pPr>
-              <w:ind w:left="360"/>
-              <w:rPr>
-                <w:b w:val="0"/>
-                <w:bCs w:val="0"/>
-                <w:sz w:val="22"/>
-              </w:rPr>
-            </w:pPr>
-          </w:p>
-          <w:p>
-            <w:pPr>
-              <w:numPr>
-                <w:ilvl w:val="0"/>
-                <w:numId w:val="1"/>
-              </w:numPr>
-              <w:rPr>
-                <w:b w:val="0"/>
-                <w:bCs w:val="0"/>
-                <w:sz w:val="22"/>
-              </w:rPr>
-            </w:pPr>
-            <w:r>
-              <w:rPr>
-                <w:b w:val="0"/>
-                <w:bCs w:val="0"/>
-                <w:sz w:val="22"/>
-              </w:rPr>
-              <w:t>……………………………………………………</w:t>
-            </w:r>
-          </w:p>
-          <w:p>
-            <w:pPr>
-              <w:ind w:left="360"/>
-              <w:rPr>
-                <w:b w:val="0"/>
-                <w:bCs w:val="0"/>
-                <w:sz w:val="22"/>
-              </w:rPr>
-            </w:pPr>
-          </w:p>
-          <w:p>
-            <w:pPr>
-              <w:numPr>
-                <w:ilvl w:val="0"/>
-                <w:numId w:val="1"/>
-              </w:numPr>
-              <w:rPr>
-                <w:b w:val="0"/>
-                <w:bCs w:val="0"/>
-                <w:sz w:val="22"/>
-              </w:rPr>
-            </w:pPr>
-            <w:r>
-              <w:rPr>
-                <w:b w:val="0"/>
-                <w:bCs w:val="0"/>
-                <w:sz w:val="22"/>
-              </w:rPr>
-              <w:t>……………………………………………………</w:t>
-            </w:r>
-          </w:p>
-          <w:p>
-            <w:pPr>
-              <w:ind w:left="360"/>
-              <w:rPr>
-                <w:b w:val="0"/>
-                <w:bCs w:val="0"/>
-                <w:sz w:val="22"/>
-              </w:rPr>
-            </w:pPr>
-          </w:p>
-          <w:p>
-            <w:pPr>
-              <w:numPr>
-                <w:ilvl w:val="0"/>
-                <w:numId w:val="1"/>
-              </w:numPr>
-              <w:rPr>
-                <w:b w:val="0"/>
-                <w:bCs w:val="0"/>
-                <w:sz w:val="22"/>
-              </w:rPr>
-            </w:pPr>
-            <w:r>
-              <w:rPr>
-                <w:b w:val="0"/>
-                <w:bCs w:val="0"/>
-                <w:sz w:val="22"/>
-              </w:rPr>
-              <w:t>……………………………………………………</w:t>
-            </w:r>
-          </w:p>
-          <w:p>
-            <w:pPr>
-              <w:pStyle w:val="10"/>
-              <w:rPr>
-                <w:b w:val="0"/>
-                <w:bCs w:val="0"/>
-                <w:sz w:val="22"/>
-              </w:rPr>
-            </w:pPr>
-          </w:p>
-          <w:p>
-            <w:pPr>
-              <w:numPr>
-                <w:ilvl w:val="0"/>
-                <w:numId w:val="1"/>
-              </w:numPr>
-              <w:rPr>
-                <w:b w:val="0"/>
-                <w:bCs w:val="0"/>
-                <w:sz w:val="22"/>
-              </w:rPr>
-            </w:pPr>
-            <w:r>
-              <w:rPr>
-                <w:b w:val="0"/>
-                <w:bCs w:val="0"/>
-                <w:sz w:val="22"/>
-              </w:rPr>
-              <w:t>……………………………………………………</w:t>
-            </w:r>
-          </w:p>
-          <w:p>
-            <w:pPr>
-              <w:pStyle w:val="10"/>
-              <w:rPr>
-                <w:b w:val="0"/>
-                <w:bCs w:val="0"/>
-                <w:sz w:val="22"/>
-              </w:rPr>
-            </w:pPr>
-          </w:p>
-          <w:p>
-            <w:pPr>
-              <w:numPr>
-                <w:ilvl w:val="0"/>
-                <w:numId w:val="1"/>
-              </w:numPr>
-              <w:rPr>
-                <w:b w:val="0"/>
-                <w:bCs w:val="0"/>
-                <w:sz w:val="22"/>
-              </w:rPr>
-            </w:pPr>
-            <w:r>
-              <w:rPr>
-                <w:b w:val="0"/>
-                <w:bCs w:val="0"/>
-                <w:sz w:val="22"/>
-              </w:rPr>
-              <w:t>……………………………………………………</w:t>
-            </w:r>
-          </w:p>
-          <w:p>
-            <w:pPr>
-              <w:pStyle w:val="10"/>
-              <w:rPr>
-                <w:b w:val="0"/>
-                <w:bCs w:val="0"/>
-                <w:sz w:val="22"/>
-              </w:rPr>
-            </w:pPr>
-          </w:p>
-          <w:p>
-            <w:pPr>
-              <w:numPr>
-                <w:ilvl w:val="0"/>
-                <w:numId w:val="1"/>
-              </w:numPr>
-              <w:rPr>
-                <w:b w:val="0"/>
-                <w:bCs w:val="0"/>
-                <w:sz w:val="22"/>
-              </w:rPr>
-            </w:pPr>
-            <w:r>
-              <w:rPr>
-                <w:b w:val="0"/>
-                <w:bCs w:val="0"/>
-                <w:sz w:val="22"/>
-              </w:rPr>
-              <w:t>……………………………………………………</w:t>
-            </w:r>
-          </w:p>
-          <w:p>
-            <w:pPr>
-              <w:ind w:left="360"/>
-              <w:rPr>
-                <w:b w:val="0"/>
-                <w:bCs w:val="0"/>
-                <w:sz w:val="22"/>
-              </w:rPr>
-            </w:pPr>
-          </w:p>
-          <w:p>
-            <w:pPr>
-              <w:numPr>
-                <w:ilvl w:val="0"/>
-                <w:numId w:val="1"/>
-              </w:numPr>
-              <w:rPr>
-                <w:b w:val="0"/>
-                <w:bCs w:val="0"/>
-                <w:sz w:val="22"/>
-              </w:rPr>
-            </w:pPr>
-            <w:r>
-              <w:rPr>
-                <w:b w:val="0"/>
-                <w:bCs w:val="0"/>
-                <w:sz w:val="22"/>
-              </w:rPr>
-              <w:t>……………………………………………………</w:t>
+                <w:rFonts w:hint="default"/>
+                <w:b w:val="0"/>
+                <w:bCs w:val="0"/>
+                <w:sz w:val="22"/>
+              </w:rPr>
+              <w:t>{@ThucDonManLuuMau}</w:t>
             </w:r>
           </w:p>
         </w:tc>
@@ -652,258 +512,20 @@
           </w:p>
           <w:p>
             <w:pPr>
-              <w:numPr>
-                <w:ilvl w:val="0"/>
-                <w:numId w:val="2"/>
-              </w:numPr>
-              <w:rPr>
-                <w:b w:val="0"/>
-                <w:bCs w:val="0"/>
-                <w:sz w:val="22"/>
-              </w:rPr>
-            </w:pPr>
-            <w:r>
-              <w:rPr>
-                <w:b w:val="0"/>
-                <w:bCs w:val="0"/>
-                <w:sz w:val="22"/>
-              </w:rPr>
-              <w:t>……………………………………………………</w:t>
-            </w:r>
-          </w:p>
-          <w:p>
-            <w:pPr>
-              <w:ind w:left="360"/>
-              <w:rPr>
-                <w:b w:val="0"/>
-                <w:bCs w:val="0"/>
-                <w:sz w:val="22"/>
-              </w:rPr>
-            </w:pPr>
-          </w:p>
-          <w:p>
-            <w:pPr>
-              <w:numPr>
-                <w:ilvl w:val="0"/>
-                <w:numId w:val="2"/>
-              </w:numPr>
-              <w:rPr>
-                <w:b w:val="0"/>
-                <w:bCs w:val="0"/>
-                <w:sz w:val="22"/>
-              </w:rPr>
-            </w:pPr>
-            <w:r>
-              <w:rPr>
-                <w:b w:val="0"/>
-                <w:bCs w:val="0"/>
-                <w:sz w:val="22"/>
-              </w:rPr>
-              <w:t>……………………………………………………</w:t>
-            </w:r>
-          </w:p>
-          <w:p>
-            <w:pPr>
-              <w:ind w:left="360"/>
-              <w:rPr>
-                <w:b w:val="0"/>
-                <w:bCs w:val="0"/>
-                <w:sz w:val="22"/>
-              </w:rPr>
-            </w:pPr>
-          </w:p>
-          <w:p>
-            <w:pPr>
-              <w:numPr>
-                <w:ilvl w:val="0"/>
-                <w:numId w:val="2"/>
-              </w:numPr>
-              <w:rPr>
-                <w:b w:val="0"/>
-                <w:bCs w:val="0"/>
-                <w:sz w:val="22"/>
-              </w:rPr>
-            </w:pPr>
-            <w:r>
-              <w:rPr>
-                <w:b w:val="0"/>
-                <w:bCs w:val="0"/>
-                <w:sz w:val="22"/>
-              </w:rPr>
-              <w:t>……………………………………………………</w:t>
-            </w:r>
-          </w:p>
-          <w:p>
-            <w:pPr>
-              <w:ind w:left="360"/>
-              <w:rPr>
-                <w:b w:val="0"/>
-                <w:bCs w:val="0"/>
-                <w:sz w:val="22"/>
-              </w:rPr>
-            </w:pPr>
-          </w:p>
-          <w:p>
-            <w:pPr>
-              <w:numPr>
-                <w:ilvl w:val="0"/>
-                <w:numId w:val="2"/>
-              </w:numPr>
-              <w:rPr>
-                <w:b w:val="0"/>
-                <w:bCs w:val="0"/>
-                <w:sz w:val="22"/>
-              </w:rPr>
-            </w:pPr>
-            <w:r>
-              <w:rPr>
-                <w:b w:val="0"/>
-                <w:bCs w:val="0"/>
-                <w:sz w:val="22"/>
-              </w:rPr>
-              <w:t>……………………………………………………</w:t>
-            </w:r>
-          </w:p>
-          <w:p>
-            <w:pPr>
-              <w:pStyle w:val="10"/>
-              <w:rPr>
-                <w:b w:val="0"/>
-                <w:bCs w:val="0"/>
-                <w:sz w:val="22"/>
-              </w:rPr>
-            </w:pPr>
-          </w:p>
-          <w:p>
-            <w:pPr>
-              <w:numPr>
-                <w:ilvl w:val="0"/>
-                <w:numId w:val="2"/>
-              </w:numPr>
-              <w:rPr>
-                <w:b w:val="0"/>
-                <w:bCs w:val="0"/>
-                <w:sz w:val="22"/>
-              </w:rPr>
-            </w:pPr>
-            <w:r>
-              <w:rPr>
-                <w:b w:val="0"/>
-                <w:bCs w:val="0"/>
-                <w:sz w:val="22"/>
-              </w:rPr>
-              <w:t>……………………………………………………</w:t>
-            </w:r>
-          </w:p>
-          <w:p>
-            <w:pPr>
-              <w:pStyle w:val="10"/>
-              <w:rPr>
-                <w:b w:val="0"/>
-                <w:bCs w:val="0"/>
-                <w:sz w:val="22"/>
-              </w:rPr>
-            </w:pPr>
-          </w:p>
-          <w:p>
-            <w:pPr>
-              <w:numPr>
-                <w:ilvl w:val="0"/>
-                <w:numId w:val="2"/>
-              </w:numPr>
-              <w:rPr>
-                <w:b w:val="0"/>
-                <w:bCs w:val="0"/>
-                <w:sz w:val="22"/>
-              </w:rPr>
-            </w:pPr>
-            <w:r>
-              <w:rPr>
-                <w:b w:val="0"/>
-                <w:bCs w:val="0"/>
-                <w:sz w:val="22"/>
-              </w:rPr>
-              <w:t>……………………………………………………</w:t>
-            </w:r>
-          </w:p>
-          <w:p>
-            <w:pPr>
-              <w:pStyle w:val="10"/>
-              <w:rPr>
-                <w:b w:val="0"/>
-                <w:bCs w:val="0"/>
-                <w:sz w:val="22"/>
-              </w:rPr>
-            </w:pPr>
-          </w:p>
-          <w:p>
-            <w:pPr>
-              <w:numPr>
-                <w:ilvl w:val="0"/>
-                <w:numId w:val="2"/>
-              </w:numPr>
-              <w:rPr>
-                <w:b w:val="0"/>
-                <w:bCs w:val="0"/>
-                <w:sz w:val="22"/>
-              </w:rPr>
-            </w:pPr>
-            <w:r>
-              <w:rPr>
-                <w:b w:val="0"/>
-                <w:bCs w:val="0"/>
-                <w:sz w:val="22"/>
-              </w:rPr>
-              <w:t>……………………………………………………</w:t>
-            </w:r>
-          </w:p>
-          <w:p>
-            <w:pPr>
-              <w:pStyle w:val="10"/>
-              <w:rPr>
-                <w:b w:val="0"/>
-                <w:bCs w:val="0"/>
-                <w:sz w:val="22"/>
-              </w:rPr>
-            </w:pPr>
-          </w:p>
-          <w:p>
-            <w:pPr>
-              <w:numPr>
-                <w:ilvl w:val="0"/>
-                <w:numId w:val="2"/>
-              </w:numPr>
-              <w:rPr>
-                <w:bCs w:val="0"/>
-                <w:sz w:val="22"/>
-              </w:rPr>
-            </w:pPr>
-            <w:r>
-              <w:rPr>
-                <w:b w:val="0"/>
-                <w:bCs w:val="0"/>
-                <w:sz w:val="22"/>
-              </w:rPr>
-              <w:t>……………………………………………………</w:t>
-            </w:r>
-          </w:p>
-          <w:p>
-            <w:pPr>
-              <w:pStyle w:val="10"/>
-              <w:rPr>
-                <w:bCs w:val="0"/>
-                <w:sz w:val="22"/>
-              </w:rPr>
-            </w:pPr>
-          </w:p>
-          <w:p>
-            <w:pPr>
-              <w:ind w:left="360"/>
-              <w:rPr>
-                <w:bCs w:val="0"/>
-                <w:sz w:val="22"/>
-              </w:rPr>
-            </w:pPr>
+              <w:rPr>
+                <w:bCs w:val="0"/>
+                <w:sz w:val="22"/>
+              </w:rPr>
+            </w:pPr>
+            <w:r>
+              <w:rPr>
+                <w:rFonts w:hint="default"/>
+                <w:b w:val="0"/>
+                <w:bCs/>
+                <w:sz w:val="22"/>
+              </w:rPr>
+              <w:t>{@ThucDonChayLuuMau}</w:t>
+            </w:r>
           </w:p>
         </w:tc>
       </w:tr>
@@ -925,8 +547,6 @@
           </w:tblCellMar>
         </w:tblPrEx>
         <w:trPr>
-          <w:wBefore w:w="0" w:type="dxa"/>
-          <w:wAfter w:w="0" w:type="dxa"/>
           <w:cantSplit/>
           <w:trHeight w:val="1198" w:hRule="atLeast"/>
         </w:trPr>
@@ -960,7 +580,7 @@
               <w:pStyle w:val="8"/>
               <w:numPr>
                 <w:ilvl w:val="0"/>
-                <w:numId w:val="3"/>
+                <w:numId w:val="1"/>
               </w:numPr>
               <w:spacing w:before="120" w:after="120" w:line="360" w:lineRule="auto"/>
               <w:rPr>
@@ -979,7 +599,7 @@
               <w:pStyle w:val="8"/>
               <w:numPr>
                 <w:ilvl w:val="0"/>
-                <w:numId w:val="3"/>
+                <w:numId w:val="1"/>
               </w:numPr>
               <w:spacing w:before="120" w:after="120" w:line="360" w:lineRule="auto"/>
               <w:rPr>
@@ -990,7 +610,27 @@
               <w:rPr>
                 <w:sz w:val="24"/>
               </w:rPr>
-              <w:t>Thời gian lấy mẫu:  Giờ: …………….… Ngày: ………/……./ 202….</w:t>
+              <w:t xml:space="preserve">Thời gian lấy mẫu:  Giờ: </w:t>
+            </w:r>
+            <w:r>
+              <w:rPr>
+                <w:rFonts w:hint="default"/>
+                <w:sz w:val="24"/>
+              </w:rPr>
+              <w:t>{GioLayMau}</w:t>
+            </w:r>
+            <w:r>
+              <w:rPr>
+                <w:sz w:val="24"/>
+              </w:rPr>
+              <w:t xml:space="preserve"> Ngày: </w:t>
+            </w:r>
+            <w:r>
+              <w:rPr>
+                <w:rFonts w:hint="default"/>
+                <w:sz w:val="24"/>
+              </w:rPr>
+              <w:t>{NgayLayMau}</w:t>
             </w:r>
           </w:p>
           <w:p>
@@ -998,7 +638,7 @@
               <w:pStyle w:val="8"/>
               <w:numPr>
                 <w:ilvl w:val="0"/>
-                <w:numId w:val="3"/>
+                <w:numId w:val="1"/>
               </w:numPr>
               <w:spacing w:before="120" w:after="120" w:line="360" w:lineRule="auto"/>
               <w:rPr>
@@ -1009,7 +649,29 @@
               <w:rPr>
                 <w:sz w:val="24"/>
               </w:rPr>
-              <w:t>Thời gian hủy mẫu: Giờ: …………….… Ngày: ………/……./ 202….</w:t>
+              <w:t xml:space="preserve">Thời gian hủy mẫu: Giờ: </w:t>
+            </w:r>
+            <w:r>
+              <w:rPr>
+                <w:rFonts w:hint="default"/>
+                <w:sz w:val="24"/>
+              </w:rPr>
+              <w:t>{GioHuyMau}</w:t>
+            </w:r>
+            <w:bookmarkStart w:id="0" w:name="_GoBack"/>
+            <w:bookmarkEnd w:id="0"/>
+            <w:r>
+              <w:rPr>
+                <w:sz w:val="24"/>
+              </w:rPr>
+              <w:t xml:space="preserve"> Ngày: </w:t>
+            </w:r>
+            <w:r>
+              <w:rPr>
+                <w:rFonts w:hint="default"/>
+                <w:sz w:val="24"/>
+              </w:rPr>
+              <w:t>{NgayHuyMau}</w:t>
             </w:r>
           </w:p>
           <w:p>
@@ -1017,7 +679,7 @@
               <w:pStyle w:val="8"/>
               <w:numPr>
                 <w:ilvl w:val="0"/>
-                <w:numId w:val="3"/>
+                <w:numId w:val="1"/>
               </w:numPr>
               <w:spacing w:before="120" w:after="120" w:line="360" w:lineRule="auto"/>
               <w:rPr>
@@ -1036,7 +698,7 @@
               <w:pStyle w:val="8"/>
               <w:numPr>
                 <w:ilvl w:val="0"/>
-                <w:numId w:val="3"/>
+                <w:numId w:val="1"/>
               </w:numPr>
               <w:spacing w:before="120" w:after="120" w:line="360" w:lineRule="auto"/>
               <w:rPr>
@@ -1070,8 +732,6 @@
           </w:tblCellMar>
         </w:tblPrEx>
         <w:trPr>
-          <w:wBefore w:w="0" w:type="dxa"/>
-          <w:wAfter w:w="0" w:type="dxa"/>
           <w:cantSplit/>
           <w:trHeight w:val="2906" w:hRule="atLeast"/>
         </w:trPr>
@@ -1376,133 +1036,6 @@
 <file path=word/numbering.xml><?xml version="1.0" encoding="utf-8"?>
 <w:numbering xmlns:wpc="http://schemas.microsoft.com/office/word/2010/wordprocessingCanvas" xmlns:mc="http://schemas.openxmlformats.org/markup-compatibility/2006" xmlns:o="urn:schemas-microsoft-com:office:office" xmlns:r="http://schemas.openxmlformats.org/officeDocument/2006/relationships" xmlns:m="http://schemas.openxmlformats.org/officeDocument/2006/math" xmlns:v="urn:schemas-microsoft-com:vml" xmlns:wp14="http://schemas.microsoft.com/office/word/2010/wordprocessingDrawing" xmlns:wp="http://schemas.openxmlformats.org/drawingml/2006/wordprocessingDrawing" xmlns:w10="urn:schemas-microsoft-com:office:word" xmlns:w="http://schemas.openxmlformats.org/wordprocessingml/2006/main" xmlns:w14="http://schemas.microsoft.com/office/word/2010/wordml" xmlns:wpg="http://schemas.microsoft.com/office/word/2010/wordprocessingGroup" xmlns:wpi="http://schemas.microsoft.com/office/word/2010/wordprocessingInk" xmlns:wne="http://schemas.microsoft.com/office/word/2006/wordml" xmlns:wps="http://schemas.microsoft.com/office/word/2010/wordprocessingShape" xmlns:wpsCustomData="http://www.wps.cn/officeDocument/2013/wpsCustomData" mc:Ignorable="w14 wp14">
   <w:abstractNum w:abstractNumId="0">
-    <w:nsid w:val="30D938A1"/>
-    <w:multiLevelType w:val="multilevel"/>
-    <w:tmpl w:val="30D938A1"/>
-    <w:lvl w:ilvl="0" w:tentative="0">
-      <w:start w:val="1"/>
-      <w:numFmt w:val="decimal"/>
-      <w:lvlText w:val="%1."/>
-      <w:lvlJc w:val="left"/>
-      <w:pPr>
-        <w:tabs>
-          <w:tab w:val="left" w:pos="720"/>
-        </w:tabs>
-        <w:ind w:left="360" w:firstLine="0"/>
-      </w:pPr>
-      <w:rPr>
-        <w:rFonts w:hint="default" w:ascii="Arial" w:hAnsi="Arial"/>
-        <w:b w:val="0"/>
-        <w:caps w:val="0"/>
-        <w:strike w:val="0"/>
-        <w:dstrike w:val="0"/>
-        <w:outline w:val="0"/>
-        <w:shadow w:val="0"/>
-        <w:emboss w:val="0"/>
-        <w:imprint w:val="0"/>
-        <w:vanish w:val="0"/>
-        <w:sz w:val="22"/>
-        <w:vertAlign w:val="baseline"/>
-      </w:rPr>
-    </w:lvl>
-    <w:lvl w:ilvl="1" w:tentative="0">
-      <w:start w:val="1"/>
-      <w:numFmt w:val="lowerLetter"/>
-      <w:lvlText w:val="%2."/>
-      <w:lvlJc w:val="left"/>
-      <w:pPr>
-        <w:tabs>
-          <w:tab w:val="left" w:pos="1440"/>
-        </w:tabs>
-        <w:ind w:left="1440" w:hanging="360"/>
-      </w:pPr>
-    </w:lvl>
-    <w:lvl w:ilvl="2" w:tentative="0">
-      <w:start w:val="1"/>
-      <w:numFmt w:val="lowerRoman"/>
-      <w:lvlText w:val="%3."/>
-      <w:lvlJc w:val="right"/>
-      <w:pPr>
-        <w:tabs>
-          <w:tab w:val="left" w:pos="2160"/>
-        </w:tabs>
-        <w:ind w:left="2160" w:hanging="180"/>
-      </w:pPr>
-    </w:lvl>
-    <w:lvl w:ilvl="3" w:tentative="0">
-      <w:start w:val="1"/>
-      <w:numFmt w:val="decimal"/>
-      <w:lvlText w:val="%4."/>
-      <w:lvlJc w:val="left"/>
-      <w:pPr>
-        <w:tabs>
-          <w:tab w:val="left" w:pos="2880"/>
-        </w:tabs>
-        <w:ind w:left="2880" w:hanging="360"/>
-      </w:pPr>
-    </w:lvl>
-    <w:lvl w:ilvl="4" w:tentative="0">
-      <w:start w:val="1"/>
-      <w:numFmt w:val="lowerLetter"/>
-      <w:lvlText w:val="%5."/>
-      <w:lvlJc w:val="left"/>
-      <w:pPr>
-        <w:tabs>
-          <w:tab w:val="left" w:pos="3600"/>
-        </w:tabs>
-        <w:ind w:left="3600" w:hanging="360"/>
-      </w:pPr>
-    </w:lvl>
-    <w:lvl w:ilvl="5" w:tentative="0">
-      <w:start w:val="1"/>
-      <w:numFmt w:val="lowerRoman"/>
-      <w:lvlText w:val="%6."/>
-      <w:lvlJc w:val="right"/>
-      <w:pPr>
-        <w:tabs>
-          <w:tab w:val="left" w:pos="4320"/>
-        </w:tabs>
-        <w:ind w:left="4320" w:hanging="180"/>
-      </w:pPr>
-    </w:lvl>
-    <w:lvl w:ilvl="6" w:tentative="0">
-      <w:start w:val="1"/>
-      <w:numFmt w:val="decimal"/>
-      <w:lvlText w:val="%7."/>
-      <w:lvlJc w:val="left"/>
-      <w:pPr>
-        <w:tabs>
-          <w:tab w:val="left" w:pos="5040"/>
-        </w:tabs>
-        <w:ind w:left="5040" w:hanging="360"/>
-      </w:pPr>
-    </w:lvl>
-    <w:lvl w:ilvl="7" w:tentative="0">
-      <w:start w:val="1"/>
-      <w:numFmt w:val="lowerLetter"/>
-      <w:lvlText w:val="%8."/>
-      <w:lvlJc w:val="left"/>
-      <w:pPr>
-        <w:tabs>
-          <w:tab w:val="left" w:pos="5760"/>
-        </w:tabs>
-        <w:ind w:left="5760" w:hanging="360"/>
-      </w:pPr>
-    </w:lvl>
-    <w:lvl w:ilvl="8" w:tentative="0">
-      <w:start w:val="1"/>
-      <w:numFmt w:val="lowerRoman"/>
-      <w:lvlText w:val="%9."/>
-      <w:lvlJc w:val="right"/>
-      <w:pPr>
-        <w:tabs>
-          <w:tab w:val="left" w:pos="6480"/>
-        </w:tabs>
-        <w:ind w:left="6480" w:hanging="180"/>
-      </w:pPr>
-    </w:lvl>
-  </w:abstractNum>
-  <w:abstractNum w:abstractNumId="1">
     <w:nsid w:val="55112A86"/>
     <w:multiLevelType w:val="multilevel"/>
     <w:tmpl w:val="55112A86"/>
@@ -1618,140 +1151,8 @@
       </w:pPr>
     </w:lvl>
   </w:abstractNum>
-  <w:abstractNum w:abstractNumId="2">
-    <w:nsid w:val="606C6577"/>
-    <w:multiLevelType w:val="multilevel"/>
-    <w:tmpl w:val="606C6577"/>
-    <w:lvl w:ilvl="0" w:tentative="0">
-      <w:start w:val="1"/>
-      <w:numFmt w:val="decimal"/>
-      <w:lvlText w:val="%1."/>
-      <w:lvlJc w:val="left"/>
-      <w:pPr>
-        <w:tabs>
-          <w:tab w:val="left" w:pos="720"/>
-        </w:tabs>
-        <w:ind w:left="360" w:firstLine="0"/>
-      </w:pPr>
-      <w:rPr>
-        <w:rFonts w:hint="default" w:ascii="Arial" w:hAnsi="Arial"/>
-        <w:caps w:val="0"/>
-        <w:strike w:val="0"/>
-        <w:dstrike w:val="0"/>
-        <w:outline w:val="0"/>
-        <w:shadow w:val="0"/>
-        <w:emboss w:val="0"/>
-        <w:imprint w:val="0"/>
-        <w:vanish w:val="0"/>
-        <w:sz w:val="22"/>
-        <w:vertAlign w:val="baseline"/>
-      </w:rPr>
-    </w:lvl>
-    <w:lvl w:ilvl="1" w:tentative="0">
-      <w:start w:val="1"/>
-      <w:numFmt w:val="lowerLetter"/>
-      <w:lvlText w:val="%2."/>
-      <w:lvlJc w:val="left"/>
-      <w:pPr>
-        <w:tabs>
-          <w:tab w:val="left" w:pos="1440"/>
-        </w:tabs>
-        <w:ind w:left="1440" w:hanging="360"/>
-      </w:pPr>
-    </w:lvl>
-    <w:lvl w:ilvl="2" w:tentative="0">
-      <w:start w:val="1"/>
-      <w:numFmt w:val="lowerRoman"/>
-      <w:lvlText w:val="%3."/>
-      <w:lvlJc w:val="right"/>
-      <w:pPr>
-        <w:tabs>
-          <w:tab w:val="left" w:pos="2160"/>
-        </w:tabs>
-        <w:ind w:left="2160" w:hanging="180"/>
-      </w:pPr>
-    </w:lvl>
-    <w:lvl w:ilvl="3" w:tentative="0">
-      <w:start w:val="1"/>
-      <w:numFmt w:val="decimal"/>
-      <w:lvlText w:val="%4."/>
-      <w:lvlJc w:val="left"/>
-      <w:pPr>
-        <w:tabs>
-          <w:tab w:val="left" w:pos="2880"/>
-        </w:tabs>
-        <w:ind w:left="2880" w:hanging="360"/>
-      </w:pPr>
-    </w:lvl>
-    <w:lvl w:ilvl="4" w:tentative="0">
-      <w:start w:val="1"/>
-      <w:numFmt w:val="lowerLetter"/>
-      <w:lvlText w:val="%5."/>
-      <w:lvlJc w:val="left"/>
-      <w:pPr>
-        <w:tabs>
-          <w:tab w:val="left" w:pos="3600"/>
-        </w:tabs>
-        <w:ind w:left="3600" w:hanging="360"/>
-      </w:pPr>
-    </w:lvl>
-    <w:lvl w:ilvl="5" w:tentative="0">
-      <w:start w:val="1"/>
-      <w:numFmt w:val="lowerRoman"/>
-      <w:lvlText w:val="%6."/>
-      <w:lvlJc w:val="right"/>
-      <w:pPr>
-        <w:tabs>
-          <w:tab w:val="left" w:pos="4320"/>
-        </w:tabs>
-        <w:ind w:left="4320" w:hanging="180"/>
-      </w:pPr>
-    </w:lvl>
-    <w:lvl w:ilvl="6" w:tentative="0">
-      <w:start w:val="1"/>
-      <w:numFmt w:val="decimal"/>
-      <w:lvlText w:val="%7."/>
-      <w:lvlJc w:val="left"/>
-      <w:pPr>
-        <w:tabs>
-          <w:tab w:val="left" w:pos="5040"/>
-        </w:tabs>
-        <w:ind w:left="5040" w:hanging="360"/>
-      </w:pPr>
-    </w:lvl>
-    <w:lvl w:ilvl="7" w:tentative="0">
-      <w:start w:val="1"/>
-      <w:numFmt w:val="lowerLetter"/>
-      <w:lvlText w:val="%8."/>
-      <w:lvlJc w:val="left"/>
-      <w:pPr>
-        <w:tabs>
-          <w:tab w:val="left" w:pos="5760"/>
-        </w:tabs>
-        <w:ind w:left="5760" w:hanging="360"/>
-      </w:pPr>
-    </w:lvl>
-    <w:lvl w:ilvl="8" w:tentative="0">
-      <w:start w:val="1"/>
-      <w:numFmt w:val="lowerRoman"/>
-      <w:lvlText w:val="%9."/>
-      <w:lvlJc w:val="right"/>
-      <w:pPr>
-        <w:tabs>
-          <w:tab w:val="left" w:pos="6480"/>
-        </w:tabs>
-        <w:ind w:left="6480" w:hanging="180"/>
-      </w:pPr>
-    </w:lvl>
-  </w:abstractNum>
   <w:num w:numId="1">
-    <w:abstractNumId w:val="2"/>
-  </w:num>
-  <w:num w:numId="2">
     <w:abstractNumId w:val="0"/>
-  </w:num>
-  <w:num w:numId="3">
-    <w:abstractNumId w:val="1"/>
   </w:num>
 </w:numbering>
 </file>
@@ -1761,7 +1162,7 @@
   <w:docDefaults>
     <w:rPrDefault>
       <w:rPr>
-        <w:rFonts w:ascii="Times New Roman" w:hAnsi="Times New Roman" w:eastAsia="Times New Roman" w:cs="Times New Roman"/>
+        <w:rFonts w:ascii="Times New Roman" w:hAnsi="Times New Roman" w:eastAsia="SimSun" w:cs="Times New Roman"/>
       </w:rPr>
     </w:rPrDefault>
     <w:pPrDefault/>
@@ -1799,7 +1200,7 @@
     <w:lsdException w:unhideWhenUsed="0" w:uiPriority="0" w:semiHidden="0" w:name="footnote text"/>
     <w:lsdException w:unhideWhenUsed="0" w:uiPriority="0" w:semiHidden="0" w:name="annotation text"/>
     <w:lsdException w:unhideWhenUsed="0" w:uiPriority="0" w:semiHidden="0" w:name="header"/>
-    <w:lsdException w:unhideWhenUsed="0" w:uiPriority="0" w:semiHidden="0" w:name="footer"/>
+    <w:lsdException w:qFormat="1" w:unhideWhenUsed="0" w:uiPriority="0" w:semiHidden="0" w:name="footer"/>
     <w:lsdException w:unhideWhenUsed="0" w:uiPriority="0" w:semiHidden="0" w:name="index heading"/>
     <w:lsdException w:qFormat="1" w:uiPriority="0" w:name="caption"/>
     <w:lsdException w:unhideWhenUsed="0" w:uiPriority="0" w:semiHidden="0" w:name="table of figures"/>
@@ -1832,9 +1233,9 @@
     <w:lsdException w:qFormat="1" w:unhideWhenUsed="0" w:uiPriority="0" w:semiHidden="0" w:name="Title"/>
     <w:lsdException w:unhideWhenUsed="0" w:uiPriority="0" w:semiHidden="0" w:name="Closing"/>
     <w:lsdException w:unhideWhenUsed="0" w:uiPriority="0" w:semiHidden="0" w:name="Signature"/>
-    <w:lsdException w:unhideWhenUsed="0" w:uiPriority="0" w:name="Default Paragraph Font"/>
+    <w:lsdException w:qFormat="1" w:unhideWhenUsed="0" w:uiPriority="0" w:name="Default Paragraph Font"/>
     <w:lsdException w:unhideWhenUsed="0" w:uiPriority="0" w:semiHidden="0" w:name="Body Text"/>
-    <w:lsdException w:unhideWhenUsed="0" w:uiPriority="0" w:semiHidden="0" w:name="Body Text Indent"/>
+    <w:lsdException w:qFormat="1" w:unhideWhenUsed="0" w:uiPriority="0" w:semiHidden="0" w:name="Body Text Indent"/>
     <w:lsdException w:unhideWhenUsed="0" w:uiPriority="0" w:semiHidden="0" w:name="List Continue"/>
     <w:lsdException w:unhideWhenUsed="0" w:uiPriority="0" w:semiHidden="0" w:name="List Continue 2"/>
     <w:lsdException w:unhideWhenUsed="0" w:uiPriority="0" w:semiHidden="0" w:name="List Continue 3"/>
@@ -1870,7 +1271,7 @@
     <w:lsdException w:unhideWhenUsed="0" w:uiPriority="0" w:semiHidden="0" w:name="HTML Sample"/>
     <w:lsdException w:unhideWhenUsed="0" w:uiPriority="0" w:semiHidden="0" w:name="HTML Typewriter"/>
     <w:lsdException w:unhideWhenUsed="0" w:uiPriority="0" w:semiHidden="0" w:name="HTML Variable"/>
-    <w:lsdException w:unhideWhenUsed="0" w:uiPriority="0" w:name="Normal Table"/>
+    <w:lsdException w:qFormat="1" w:unhideWhenUsed="0" w:uiPriority="0" w:name="Normal Table"/>
     <w:lsdException w:unhideWhenUsed="0" w:uiPriority="0" w:semiHidden="0" w:name="annotation subject"/>
     <w:lsdException w:unhideWhenUsed="0" w:uiPriority="0" w:semiHidden="0" w:name="Table Simple 1"/>
     <w:lsdException w:unhideWhenUsed="0" w:uiPriority="0" w:semiHidden="0" w:name="Table Simple 2"/>
@@ -2022,7 +1423,7 @@
     <w:qFormat/>
     <w:uiPriority w:val="0"/>
     <w:rPr>
-      <w:rFonts w:ascii="Arial" w:hAnsi="Arial" w:cs="Arial"/>
+      <w:rFonts w:ascii="Arial" w:hAnsi="Arial" w:eastAsia="Times New Roman" w:cs="Arial"/>
       <w:b/>
       <w:bCs/>
       <w:color w:val="000000"/>
@@ -2100,14 +1501,15 @@
   <w:style w:type="character" w:default="1" w:styleId="6">
     <w:name w:val="Default Paragraph Font"/>
     <w:semiHidden/>
+    <w:qFormat/>
     <w:uiPriority w:val="0"/>
   </w:style>
   <w:style w:type="table" w:default="1" w:styleId="7">
     <w:name w:val="Normal Table"/>
     <w:semiHidden/>
+    <w:qFormat/>
     <w:uiPriority w:val="0"/>
     <w:tblPr>
-      <w:tblStyle w:val="7"/>
       <w:tblCellMar>
         <w:top w:w="0" w:type="dxa"/>
         <w:left w:w="108" w:type="dxa"/>
@@ -2115,13 +1517,11 @@
         <w:right w:w="108" w:type="dxa"/>
       </w:tblCellMar>
     </w:tblPr>
-    <w:trPr>
-      <w:wBefore w:w="0" w:type="dxa"/>
-    </w:trPr>
   </w:style>
   <w:style w:type="paragraph" w:styleId="8">
     <w:name w:val="Body Text Indent"/>
     <w:basedOn w:val="1"/>
+    <w:qFormat/>
     <w:uiPriority w:val="0"/>
     <w:pPr>
       <w:ind w:left="264"/>
@@ -2134,6 +1534,7 @@
   <w:style w:type="paragraph" w:styleId="9">
     <w:name w:val="footer"/>
     <w:basedOn w:val="1"/>
+    <w:qFormat/>
     <w:uiPriority w:val="0"/>
     <w:pPr>
       <w:tabs>

</xml_diff>